<commit_message>
Restore resume styling and refine public portfolio pages
</commit_message>
<xml_diff>
--- a/content/resume/ataimo-edem-resume.docx
+++ b/content/resume/ataimo-edem-resume.docx
@@ -122,7 +122,7 @@
               <w:jc w:val="center"/>
             </w:pPr>
             <w:r>
-              <w:t>Lagos, Nigeria | https://ataimo.com | edemataimo@gmail.com | contact@ataimo.com | +234 816 0594 893 | LinkedIn | GitHub</w:t>
+              <w:t>Lagos, Nigeria | contact@ataimo.com | edemataimo@gmail.com | https://ataimo.com | +234 816 0594 893 | LinkedIn | GitHub</w:t>
             </w:r>
           </w:p>
         </w:tc>
@@ -1981,20 +1981,67 @@
             </w:tcBorders>
           </w:tcPr>
           <w:p>
+            <w:pPr>
+              <w:spacing w:after="40"/>
+            </w:pPr>
             <w:r>
+              <w:rPr>
+                <w:rFonts w:ascii="Carlito" w:hAnsi="Carlito" w:eastAsia="Carlito"/>
+                <w:b/>
+                <w:i w:val="0"/>
+                <w:color w:val="0B1F33"/>
+                <w:sz w:val="19"/>
+              </w:rPr>
               <w:t>Ataimo Portfolio &amp; Consultancy Platform — https://ataimo.com</w:t>
             </w:r>
           </w:p>
           <w:p>
+            <w:pPr>
+              <w:spacing w:after="40" w:line="240" w:lineRule="auto"/>
+            </w:pPr>
             <w:r>
+              <w:rPr>
+                <w:rFonts w:ascii="Carlito" w:hAnsi="Carlito" w:eastAsia="Carlito"/>
+                <w:b w:val="0"/>
+                <w:i w:val="0"/>
+                <w:sz w:val="17"/>
+              </w:rPr>
               <w:t>Designed, built and deployed a full-stack engineering portfolio and consultancy platform on Azure K3s. Integrates Keycloak OIDC with native and four social sign-in providers, PostgreSQL-backed request-and-approve bookings, engagement/task tracking, private chat, an owner dashboard and mailbox, and installable PWA notifications. Uses Redpanda for background events, Prometheus/Grafana for live telemetry, Envoy Gateway for multisite routing, and cert-manager for TLS. Terraform, Ansible, Helm and GitHub Actions provision infrastructure and deliver app/worker images through Docker Hub; interactive 3D diagrams explain the deployed architecture.</w:t>
             </w:r>
           </w:p>
           <w:p>
+            <w:pPr>
+              <w:spacing w:after="60"/>
+            </w:pPr>
             <w:r>
+              <w:rPr>
+                <w:rFonts w:ascii="Carlito" w:hAnsi="Carlito" w:eastAsia="Carlito"/>
+                <w:b/>
+                <w:i w:val="0"/>
+                <w:color w:val="17A2A4"/>
+                <w:sz w:val="16"/>
+              </w:rPr>
               <w:t>TypeScript • Next.js • React • Azure • Kubernetes • Terraform • Ansible • Helm • OIDC • PostgreSQL • Redpanda • CI/CD</w:t>
             </w:r>
           </w:p>
+        </w:tc>
+        <w:tc>
+          <w:tcPr>
+            <w:tcW w:type="dxa" w:w="5328"/>
+            <w:shd w:fill="F7F9FA"/>
+            <w:tcMar>
+              <w:top w:w="115" w:type="dxa"/>
+              <w:start w:w="110" w:type="dxa"/>
+              <w:bottom w:w="105" w:type="dxa"/>
+              <w:end w:w="110" w:type="dxa"/>
+            </w:tcMar>
+            <w:tcBorders>
+              <w:top w:val="single" w:sz="4" w:space="0" w:color="D7E2E8"/>
+              <w:left w:val="single" w:sz="4" w:space="0" w:color="D7E2E8"/>
+              <w:bottom w:val="single" w:sz="4" w:space="0" w:color="D7E2E8"/>
+              <w:right w:val="single" w:sz="4" w:space="0" w:color="D7E2E8"/>
+            </w:tcBorders>
+          </w:tcPr>
           <w:p>
             <w:pPr>
               <w:spacing w:after="40"/>
@@ -2040,10 +2087,15 @@
             </w:r>
           </w:p>
         </w:tc>
+      </w:tr>
+      <w:tr>
+        <w:trPr>
+          <w:cantSplit/>
+        </w:trPr>
         <w:tc>
           <w:tcPr>
             <w:tcW w:type="dxa" w:w="5328"/>
-            <w:shd w:fill="F7F9FA"/>
+            <w:shd w:fill="F2F6F8"/>
             <w:tcMar>
               <w:top w:w="115" w:type="dxa"/>
               <w:start w:w="110" w:type="dxa"/>
@@ -2102,15 +2154,10 @@
             </w:r>
           </w:p>
         </w:tc>
-      </w:tr>
-      <w:tr>
-        <w:trPr>
-          <w:cantSplit/>
-        </w:trPr>
         <w:tc>
           <w:tcPr>
             <w:tcW w:type="dxa" w:w="5328"/>
-            <w:shd w:fill="F2F6F8"/>
+            <w:shd w:fill="F7F9FA"/>
             <w:tcMar>
               <w:top w:w="115" w:type="dxa"/>
               <w:start w:w="110" w:type="dxa"/>
@@ -2169,10 +2216,15 @@
             </w:r>
           </w:p>
         </w:tc>
+      </w:tr>
+      <w:tr>
+        <w:trPr>
+          <w:cantSplit/>
+        </w:trPr>
         <w:tc>
           <w:tcPr>
             <w:tcW w:type="dxa" w:w="5328"/>
-            <w:shd w:fill="F7F9FA"/>
+            <w:shd w:fill="F2F6F8"/>
             <w:tcMar>
               <w:top w:w="115" w:type="dxa"/>
               <w:start w:w="110" w:type="dxa"/>
@@ -2231,27 +2283,22 @@
             </w:r>
           </w:p>
         </w:tc>
-      </w:tr>
-      <w:tr>
-        <w:trPr>
-          <w:cantSplit/>
-        </w:trPr>
         <w:tc>
           <w:tcPr>
             <w:tcW w:type="dxa" w:w="5328"/>
-            <w:shd w:fill="F2F6F8"/>
+            <w:shd w:fill="FFFFFF"/>
+            <w:tcBorders>
+              <w:top w:val="nil"/>
+              <w:left w:val="nil"/>
+              <w:bottom w:val="nil"/>
+              <w:right w:val="nil"/>
+            </w:tcBorders>
             <w:tcMar>
               <w:top w:w="115" w:type="dxa"/>
               <w:start w:w="110" w:type="dxa"/>
               <w:bottom w:w="105" w:type="dxa"/>
               <w:end w:w="110" w:type="dxa"/>
             </w:tcMar>
-            <w:tcBorders>
-              <w:top w:val="single" w:sz="4" w:space="0" w:color="D7E2E8"/>
-              <w:left w:val="single" w:sz="4" w:space="0" w:color="D7E2E8"/>
-              <w:bottom w:val="single" w:sz="4" w:space="0" w:color="D7E2E8"/>
-              <w:right w:val="single" w:sz="4" w:space="0" w:color="D7E2E8"/>
-            </w:tcBorders>
           </w:tcPr>
           <w:p>
             <w:pPr>
@@ -2296,30 +2343,6 @@
               </w:rPr>
               <w:t>Go • API Security • MurmurHash • SHA-256</w:t>
             </w:r>
-          </w:p>
-        </w:tc>
-        <w:tc>
-          <w:tcPr>
-            <w:tcW w:type="dxa" w:w="5328"/>
-            <w:shd w:fill="FFFFFF"/>
-            <w:tcBorders>
-              <w:top w:val="nil"/>
-              <w:left w:val="nil"/>
-              <w:bottom w:val="nil"/>
-              <w:right w:val="nil"/>
-            </w:tcBorders>
-            <w:tcMar>
-              <w:top w:w="115" w:type="dxa"/>
-              <w:start w:w="110" w:type="dxa"/>
-              <w:bottom w:w="105" w:type="dxa"/>
-              <w:end w:w="110" w:type="dxa"/>
-            </w:tcMar>
-          </w:tcPr>
-          <w:p>
-            <w:pPr>
-              <w:spacing w:after="60"/>
-            </w:pPr>
-            <w:r/>
           </w:p>
         </w:tc>
       </w:tr>
@@ -2868,23 +2891,7 @@
               <w:spacing w:after="20"/>
             </w:pPr>
             <w:r>
-              <w:rPr>
-                <w:rFonts w:ascii="Carlito" w:hAnsi="Carlito" w:eastAsia="Carlito"/>
-                <w:b/>
-                <w:i w:val="0"/>
-                <w:color w:val="17A2A4"/>
-                <w:sz w:val="17"/>
-              </w:rPr>
-              <w:t xml:space="preserve">• </w:t>
-            </w:r>
-            <w:r>
-              <w:rPr>
-                <w:rFonts w:ascii="Carlito" w:hAnsi="Carlito" w:eastAsia="Carlito"/>
-                <w:b w:val="0"/>
-                <w:i w:val="0"/>
-                <w:sz w:val="17"/>
-              </w:rPr>
-              <w:t>AZ-303 Microsoft Azure Architect Technologies - Microsoft (Issued Apr 2021)</w:t>
+              <w:t>• Microsoft Certified: DevOps Engineer Expert - Microsoft</w:t>
             </w:r>
           </w:p>
           <w:p>

</xml_diff>

<commit_message>
Correct resume links, project grid and credential date
</commit_message>
<xml_diff>
--- a/content/resume/ataimo-edem-resume.docx
+++ b/content/resume/ataimo-edem-resume.docx
@@ -122,8 +122,119 @@
               <w:jc w:val="center"/>
             </w:pPr>
             <w:r>
-              <w:t>Lagos, Nigeria | contact@ataimo.com | edemataimo@gmail.com | https://ataimo.com | +234 816 0594 893 | LinkedIn | GitHub</w:t>
+              <w:rPr>
+                <w:rFonts w:ascii="Carlito" w:hAnsi="Carlito"/>
+                <w:color w:val="526A80"/>
+                <w:sz w:val="15"/>
+              </w:rPr>
+              <w:t xml:space="preserve">Lagos, Nigeria | </w:t>
             </w:r>
+            <w:hyperlink r:id="rId12">
+              <w:r>
+                <w:rPr>
+                  <w:rFonts w:ascii="Carlito" w:hAnsi="Carlito"/>
+                  <w:color w:val="007A9B"/>
+                  <w:sz w:val="15"/>
+                  <w:u w:val="single"/>
+                </w:rPr>
+                <w:t>contact@ataimo.com</w:t>
+              </w:r>
+            </w:hyperlink>
+            <w:r>
+              <w:rPr>
+                <w:rFonts w:ascii="Carlito" w:hAnsi="Carlito"/>
+                <w:color w:val="526A80"/>
+                <w:sz w:val="15"/>
+              </w:rPr>
+              <w:t xml:space="preserve"> | </w:t>
+            </w:r>
+            <w:hyperlink r:id="rId13">
+              <w:r>
+                <w:rPr>
+                  <w:rFonts w:ascii="Carlito" w:hAnsi="Carlito"/>
+                  <w:color w:val="007A9B"/>
+                  <w:sz w:val="15"/>
+                  <w:u w:val="single"/>
+                </w:rPr>
+                <w:t>ataimo.com</w:t>
+              </w:r>
+            </w:hyperlink>
+            <w:r>
+              <w:rPr>
+                <w:rFonts w:ascii="Carlito" w:hAnsi="Carlito"/>
+                <w:color w:val="526A80"/>
+                <w:sz w:val="15"/>
+              </w:rPr>
+              <w:t xml:space="preserve"> | </w:t>
+            </w:r>
+            <w:hyperlink r:id="rId14">
+              <w:r>
+                <w:rPr>
+                  <w:rFonts w:ascii="Carlito" w:hAnsi="Carlito"/>
+                  <w:color w:val="007A9B"/>
+                  <w:sz w:val="15"/>
+                  <w:u w:val="single"/>
+                </w:rPr>
+                <w:t>edemataimo@gmail.com</w:t>
+              </w:r>
+            </w:hyperlink>
+            <w:r>
+              <w:rPr>
+                <w:rFonts w:ascii="Carlito" w:hAnsi="Carlito"/>
+                <w:color w:val="526A80"/>
+                <w:sz w:val="15"/>
+              </w:rPr>
+              <w:t xml:space="preserve"> | </w:t>
+            </w:r>
+            <w:hyperlink r:id="rId15">
+              <w:r>
+                <w:rPr>
+                  <w:rFonts w:ascii="Carlito" w:hAnsi="Carlito"/>
+                  <w:color w:val="007A9B"/>
+                  <w:sz w:val="15"/>
+                  <w:u w:val="single"/>
+                </w:rPr>
+                <w:t>+234 816 0594 893</w:t>
+              </w:r>
+            </w:hyperlink>
+            <w:r>
+              <w:rPr>
+                <w:rFonts w:ascii="Carlito" w:hAnsi="Carlito"/>
+                <w:color w:val="526A80"/>
+                <w:sz w:val="15"/>
+              </w:rPr>
+              <w:t xml:space="preserve"> | </w:t>
+            </w:r>
+            <w:hyperlink r:id="rId9">
+              <w:r>
+                <w:rPr>
+                  <w:rFonts w:ascii="Carlito" w:hAnsi="Carlito"/>
+                  <w:color w:val="007A9B"/>
+                  <w:sz w:val="15"/>
+                  <w:u w:val="single"/>
+                </w:rPr>
+                <w:t>LinkedIn</w:t>
+              </w:r>
+            </w:hyperlink>
+            <w:r>
+              <w:rPr>
+                <w:rFonts w:ascii="Carlito" w:hAnsi="Carlito"/>
+                <w:color w:val="526A80"/>
+                <w:sz w:val="15"/>
+              </w:rPr>
+              <w:t xml:space="preserve"> | </w:t>
+            </w:r>
+            <w:hyperlink r:id="rId10">
+              <w:r>
+                <w:rPr>
+                  <w:rFonts w:ascii="Carlito" w:hAnsi="Carlito"/>
+                  <w:color w:val="007A9B"/>
+                  <w:sz w:val="15"/>
+                  <w:u w:val="single"/>
+                </w:rPr>
+                <w:t>GitHub</w:t>
+              </w:r>
+            </w:hyperlink>
           </w:p>
         </w:tc>
       </w:tr>
@@ -1992,7 +2103,7 @@
                 <w:color w:val="0B1F33"/>
                 <w:sz w:val="19"/>
               </w:rPr>
-              <w:t>Ataimo Portfolio &amp; Consultancy Platform — https://ataimo.com</w:t>
+              <w:t>Enterprise Developer Portal Migration Automation</w:t>
             </w:r>
           </w:p>
           <w:p>
@@ -2006,7 +2117,7 @@
                 <w:i w:val="0"/>
                 <w:sz w:val="17"/>
               </w:rPr>
-              <w:t>Designed, built and deployed a full-stack engineering portfolio and consultancy platform on Azure K3s. Integrates Keycloak OIDC with native and four social sign-in providers, PostgreSQL-backed request-and-approve bookings, engagement/task tracking, private chat, an owner dashboard and mailbox, and installable PWA notifications. Uses Redpanda for background events, Prometheus/Grafana for live telemetry, Envoy Gateway for multisite routing, and cert-manager for TLS. Terraform, Ansible, Helm and GitHub Actions provision infrastructure and deliver app/worker images through Docker Hub; interactive 3D diagrams explain the deployed architecture.</w:t>
+              <w:t>Designed and built an end-to-end Go migration solution for Tyk Classic Developer Portal to EDP. Addresses the absence of a built-in migration path that preserves developer access by retaining API keys and login credentials while providing discovery, backup, dry-run planning, idempotent migration, reconciliation, rollback, cutover and controlled decommissioning.</w:t>
             </w:r>
           </w:p>
           <w:p>
@@ -2021,7 +2132,7 @@
                 <w:color w:val="17A2A4"/>
                 <w:sz w:val="16"/>
               </w:rPr>
-              <w:t>TypeScript • Next.js • React • Azure • Kubernetes • Terraform • Ansible • Helm • OIDC • PostgreSQL • Redpanda • CI/CD</w:t>
+              <w:t>Go • REST APIs • Docker • Migration Engineering</w:t>
             </w:r>
           </w:p>
         </w:tc>
@@ -2054,7 +2165,7 @@
                 <w:color w:val="0B1F33"/>
                 <w:sz w:val="19"/>
               </w:rPr>
-              <w:t>Enterprise Developer Portal Migration Automation</w:t>
+              <w:t>Ataimo Portfolio &amp; Consultancy Platform — ataimo.com</w:t>
             </w:r>
           </w:p>
           <w:p>
@@ -2068,7 +2179,7 @@
                 <w:i w:val="0"/>
                 <w:sz w:val="17"/>
               </w:rPr>
-              <w:t>Designed and built an end-to-end Go migration solution for Tyk Classic Developer Portal to EDP. Addresses the absence of a built-in migration path that preserves developer access by retaining API keys and login credentials while providing discovery, backup, dry-run planning, idempotent migration, reconciliation, rollback, cutover and controlled decommissioning.</w:t>
+              <w:t>Designed, built and deployed a full-stack engineering portfolio and consultancy platform on Azure K3s. Integrates Keycloak OIDC with native and four social sign-in providers, PostgreSQL-backed request-and-approve bookings, engagement/task tracking, private chat, an owner dashboard and mailbox, and installable PWA notifications. Uses Redpanda for background events, Prometheus/Grafana for live telemetry, Envoy Gateway for multisite routing, and cert-manager for TLS. Terraform, Ansible, Helm and GitHub Actions provision infrastructure and deliver app/worker images through Docker Hub; interactive 3D diagrams explain the deployed architecture.</w:t>
             </w:r>
           </w:p>
           <w:p>
@@ -2083,7 +2194,7 @@
                 <w:color w:val="17A2A4"/>
                 <w:sz w:val="16"/>
               </w:rPr>
-              <w:t>Go • REST APIs • Docker • Migration Engineering</w:t>
+              <w:t>TypeScript • Next.js • React • Azure • Kubernetes • Terraform • Ansible • Helm • OIDC • PostgreSQL • Redpanda • CI/CD</w:t>
             </w:r>
           </w:p>
         </w:tc>
@@ -2286,19 +2397,19 @@
         <w:tc>
           <w:tcPr>
             <w:tcW w:type="dxa" w:w="5328"/>
-            <w:shd w:fill="FFFFFF"/>
-            <w:tcBorders>
-              <w:top w:val="nil"/>
-              <w:left w:val="nil"/>
-              <w:bottom w:val="nil"/>
-              <w:right w:val="nil"/>
-            </w:tcBorders>
+            <w:shd w:fill="F7F9FA"/>
             <w:tcMar>
               <w:top w:w="115" w:type="dxa"/>
               <w:start w:w="110" w:type="dxa"/>
               <w:bottom w:w="105" w:type="dxa"/>
               <w:end w:w="110" w:type="dxa"/>
             </w:tcMar>
+            <w:tcBorders>
+              <w:top w:val="single" w:sz="4" w:space="0" w:color="D7E2E8"/>
+              <w:left w:val="single" w:sz="4" w:space="0" w:color="D7E2E8"/>
+              <w:bottom w:val="single" w:sz="4" w:space="0" w:color="D7E2E8"/>
+              <w:right w:val="single" w:sz="4" w:space="0" w:color="D7E2E8"/>
+            </w:tcBorders>
           </w:tcPr>
           <w:p>
             <w:pPr>
@@ -2891,7 +3002,23 @@
               <w:spacing w:after="20"/>
             </w:pPr>
             <w:r>
-              <w:t>• Microsoft Certified: DevOps Engineer Expert - Microsoft</w:t>
+              <w:rPr>
+                <w:rFonts w:ascii="Carlito" w:hAnsi="Carlito" w:eastAsia="Carlito"/>
+                <w:b/>
+                <w:i w:val="0"/>
+                <w:color w:val="17A2A4"/>
+                <w:sz w:val="17"/>
+              </w:rPr>
+              <w:t xml:space="preserve">• </w:t>
+            </w:r>
+            <w:r>
+              <w:rPr>
+                <w:rFonts w:ascii="Carlito" w:hAnsi="Carlito" w:eastAsia="Carlito"/>
+                <w:b w:val="0"/>
+                <w:i w:val="0"/>
+                <w:sz w:val="17"/>
+              </w:rPr>
+              <w:t>Microsoft Certified: DevOps Engineer Expert - Microsoft (Issued November 30, 2021)</w:t>
             </w:r>
           </w:p>
           <w:p>

</xml_diff>